<commit_message>
Fix double-brace delimiters in all template loop/conditional tags
{{#services}}, {{/services}}, {{#show_discount}}, {{/show_discount}},
{{#contract_services}}, {{/contract_services}} — all were using single
braces which docxtemplater ignored with {{ }} delimiter config.

Co-Authored-By: Claude Sonnet 4.6 <noreply@anthropic.com>
</commit_message>
<xml_diff>
--- a/KP_template.docx
+++ b/KP_template.docx
@@ -391,7 +391,7 @@
                 <w:color w:val="222120"/>
                 <w:sz w:val="20"/>
               </w:rPr>
-              <w:t>{#services}{{index}}</w:t>
+              <w:t>{{#services}}{{index}}</w:t>
             </w:r>
           </w:p>
         </w:tc>
@@ -457,7 +457,7 @@
                 <w:color w:val="222120"/>
                 <w:sz w:val="20"/>
               </w:rPr>
-              <w:t>{{price}}{/services}</w:t>
+              <w:t>{{price}}{{/services}}</w:t>
             </w:r>
           </w:p>
         </w:tc>
@@ -509,7 +509,7 @@
                 <w:color w:val="999999"/>
                 <w:sz w:val="20"/>
               </w:rPr>
-              <w:t>{#show_discount}Скидка {{discount_percent}}%{/show_discount}</w:t>
+              <w:t>{{#show_discount}}Скидка {{discount_percent}}%{{/show_discount}}</w:t>
             </w:r>
           </w:p>
         </w:tc>
@@ -542,7 +542,7 @@
                 <w:color w:val="999999"/>
                 <w:sz w:val="20"/>
               </w:rPr>
-              <w:t>{#show_discount}−{{discount_amount}} ₽{/show_discount}</w:t>
+              <w:t>{{#show_discount}}−{{discount_amount}} ₽{{/show_discount}}</w:t>
             </w:r>
           </w:p>
         </w:tc>

</xml_diff>

<commit_message>
Add {{ex_*}} tags to all docx templates and wire up EX fields in builders
Templates now have dynamic executor fields instead of hardcoded Optima data.
All four builder functions pass EX object fields to docxtemplater.

Co-Authored-By: Claude Sonnet 4.6 <noreply@anthropic.com>
</commit_message>
<xml_diff>
--- a/KP_template.docx
+++ b/KP_template.docx
@@ -99,7 +99,7 @@
                 <w:color w:val="222120"/>
                 <w:sz w:val="24"/>
               </w:rPr>
-              <w:t>ООО «ОПТИМА»</w:t>
+              <w:t>{{ex_name}}</w:t>
             </w:r>
           </w:p>
           <w:p>
@@ -127,7 +127,7 @@
                 <w:color w:val="222120"/>
                 <w:sz w:val="20"/>
               </w:rPr>
-              <w:t>Email: info@buhstart.ru</w:t>
+              <w:t>Email: {{ex_email}}</w:t>
             </w:r>
           </w:p>
           <w:p>
@@ -141,7 +141,7 @@
                 <w:color w:val="222120"/>
                 <w:sz w:val="20"/>
               </w:rPr>
-              <w:t>Адрес: Архангельская область, г. Северодвинск, Первомайская ул., д. 16</w:t>
+              <w:t>Адрес: {{ex_address}}</w:t>
             </w:r>
           </w:p>
         </w:tc>
@@ -698,7 +698,7 @@
           <w:color w:val="222120"/>
           <w:sz w:val="22"/>
         </w:rPr>
-        <w:t>ООО «ОПТИМА» предоставляет услуги бухгалтерского аутсорсинга с 2003 года. В нашем штате работают 17 аттестованных бухгалтеров и аудиторов, а также 39 удалённых экономистов, что позволяет оперативно решать задачи любой сложности. Мы несём полную материальную ответственность за результат своей работы, закреплённую в договоре. Все специалисты компании регулярно проходят обучение и подтверждают квалификацию.</w:t>
+        <w:t>{{ex_name}} предоставляет услуги бухгалтерского аутсорсинга с 2003 года. В нашем штате работают 17 аттестованных бухгалтеров и аудиторов, а также 39 удалённых экономистов, что позволяет оперативно решать задачи любой сложности. Мы несём полную материальную ответственность за результат своей работы, закреплённую в договоре. Все специалисты компании регулярно проходят обучение и подтверждают квалификацию.</w:t>
       </w:r>
     </w:p>
     <w:p>
@@ -800,7 +800,7 @@
           <w:color w:val="222120"/>
           <w:sz w:val="22"/>
         </w:rPr>
-        <w:t>Руководитель ___________ Горелкина Г.В.</w:t>
+        <w:t>Руководитель ___________ {{ex_dir_short}}</w:t>
       </w:r>
     </w:p>
     <w:p>
@@ -814,7 +814,7 @@
           <w:color w:val="666666"/>
           <w:sz w:val="18"/>
         </w:rPr>
-        <w:t>ООО «ОПТИМА»</w:t>
+        <w:t>{{ex_name}}</w:t>
       </w:r>
     </w:p>
     <w:sectPr>

</xml_diff>

<commit_message>
Add INN to KP and cost/discount section to contracts
- KP: ИНН исполнителя после Email
- Договор: абзац со стоимостью услуг и условным блоком скидки перед предоплатой
- buildContractDocx: добавлены total_amount, total_amount_words, show_discount, discount_percent, original_amount

Co-Authored-By: Claude Sonnet 4.6 <noreply@anthropic.com>
</commit_message>
<xml_diff>
--- a/KP_template.docx
+++ b/KP_template.docx
@@ -128,6 +128,20 @@
                 <w:sz w:val="20"/>
               </w:rPr>
               <w:t>Email: {{ex_email}}</w:t>
+            </w:r>
+          </w:p>
+          <w:p>
+            <w:pPr>
+              <w:spacing w:after="0"/>
+              <w:jc w:val="right"/>
+            </w:pPr>
+            <w:r>
+              <w:rPr>
+                <w:rFonts w:ascii="Arial" w:hAnsi="Arial"/>
+                <w:color w:val="222120"/>
+                <w:sz w:val="20"/>
+              </w:rPr>
+              <w:t>ИНН: {{ex_inn}}</w:t>
             </w:r>
           </w:p>
           <w:p>

</xml_diff>